<commit_message>
TOC fix: How to Publish REV40 - stale five-labels entry now reads four labels; duplicate bookmark renamed
</commit_message>
<xml_diff>
--- a/How to Publish Your First Kindle Book/How to Publish Your First Kindle Book_REV40_2026-10-10.docx
+++ b/How to Publish Your First Kindle Book/How to Publish Your First Kindle Book_REV40_2026-10-10.docx
@@ -279,7 +279,7 @@
             <w:color w:val="0070C0"/>
             <w:u w:val="single"/>
           </w:rPr>
-          <w:t>The five labels</w:t>
+          <w:t xml:space="preserve">The four labels</w:t>
         </w:r>
       </w:hyperlink>
     </w:p>
@@ -11029,7 +11029,7 @@
       <w:bookmarkEnd w:id="115"/>
     </w:p>
     <w:p>
-      <w:bookmarkStart w:id="115" w:name="note_57"/>
+      <w:bookmarkStart w:id="115" w:name="note_57_d2"/>
       <w:r>
         <w:t xml:space="preserve">[42] Amazon Ads, “A guide to targeting with Sponsored Products” (checked 10 October 2026): https://advertising.amazon.com/library/guides/targeting-with-sponsored-products</w:t>
       </w:r>

</xml_diff>

<commit_message>
TOC fix: How to Publish REV40 - stale five-labels entry now reads four labels; duplicate bookmark renamed [merged onto main from book-2-lectures-after-qed 8f88be2, paths only]
</commit_message>
<xml_diff>
--- a/How to Publish Your First Kindle Book/How to Publish Your First Kindle Book_REV40_2026-10-10.docx
+++ b/How to Publish Your First Kindle Book/How to Publish Your First Kindle Book_REV40_2026-10-10.docx
@@ -279,7 +279,7 @@
             <w:color w:val="0070C0"/>
             <w:u w:val="single"/>
           </w:rPr>
-          <w:t>The five labels</w:t>
+          <w:t xml:space="preserve">The four labels</w:t>
         </w:r>
       </w:hyperlink>
     </w:p>
@@ -11029,7 +11029,7 @@
       <w:bookmarkEnd w:id="115"/>
     </w:p>
     <w:p>
-      <w:bookmarkStart w:id="115" w:name="note_57"/>
+      <w:bookmarkStart w:id="115" w:name="note_57_d2"/>
       <w:r>
         <w:t xml:space="preserve">[42] Amazon Ads, “A guide to targeting with Sponsored Products” (checked 10 October 2026): https://advertising.amazon.com/library/guides/targeting-with-sponsored-products</w:t>
       </w:r>

</xml_diff>